<commit_message>
Initial commit: Neutron OS Digital Twin Platform
</commit_message>
<xml_diff>
--- a/docs/_tools/generated/design-prompts/README.docx
+++ b/docs/_tools/generated/design-prompts/README.docx
@@ -2,6 +2,140 @@
 <file path=word/document.xml><?xml version="1.0" encoding="utf-8"?>
 <w:document xmlns:wpc="http://schemas.microsoft.com/office/word/2010/wordprocessingCanvas" xmlns:mo="http://schemas.microsoft.com/office/mac/office/2008/main" xmlns:mc="http://schemas.openxmlformats.org/markup-compatibility/2006" xmlns:mv="urn:schemas-microsoft-com:mac:vml" xmlns:o="urn:schemas-microsoft-com:office:office" xmlns:r="http://schemas.openxmlformats.org/officeDocument/2006/relationships" xmlns:m="http://schemas.openxmlformats.org/officeDocument/2006/math" xmlns:v="urn:schemas-microsoft-com:vml" xmlns:wp14="http://schemas.microsoft.com/office/word/2010/wordprocessingDrawing" xmlns:wp="http://schemas.openxmlformats.org/drawingml/2006/wordprocessingDrawing" xmlns:w10="urn:schemas-microsoft-com:office:word" xmlns:w="http://schemas.openxmlformats.org/wordprocessingml/2006/main" xmlns:w14="http://schemas.microsoft.com/office/word/2010/wordml" xmlns:wpg="http://schemas.microsoft.com/office/word/2010/wordprocessingGroup" xmlns:wpi="http://schemas.microsoft.com/office/word/2010/wordprocessingInk" xmlns:wne="http://schemas.microsoft.com/office/word/2006/wordml" xmlns:wps="http://schemas.microsoft.com/office/word/2010/wordprocessingShape" mc:Ignorable="w14 wp14">
   <w:body>
+    <w:p>
+      <w:pPr>
+        <w:pStyle w:val="Heading1"/>
+        <w:spacing w:after="240" w:before="0"/>
+      </w:pPr>
+      <w:r>
+        <w:t>Table of Contents</w:t>
+      </w:r>
+    </w:p>
+    <w:p>
+      <w:pPr>
+        <w:spacing w:after="40" w:before="40"/>
+        <w:ind w:left="0"/>
+      </w:pPr>
+      <w:hyperlink w:anchor="Design_Prompts">
+        <w:r>
+          <w:rPr>
+            <w:color w:val="0000FF"/>
+            <w:u w:val="single"/>
+          </w:rPr>
+          <w:t>Design Prompts</w:t>
+        </w:r>
+      </w:hyperlink>
+    </w:p>
+    <w:p>
+      <w:pPr>
+        <w:spacing w:after="40" w:before="40"/>
+        <w:ind w:left="360"/>
+      </w:pPr>
+      <w:hyperlink w:anchor="What_Are_Design_Prompts_">
+        <w:r>
+          <w:rPr>
+            <w:color w:val="0000FF"/>
+            <w:u w:val="single"/>
+          </w:rPr>
+          <w:t>What Are Design Prompts?</w:t>
+        </w:r>
+      </w:hyperlink>
+    </w:p>
+    <w:p>
+      <w:pPr>
+        <w:spacing w:after="40" w:before="40"/>
+        <w:ind w:left="360"/>
+      </w:pPr>
+      <w:hyperlink w:anchor="Prompt_Inventory">
+        <w:r>
+          <w:rPr>
+            <w:color w:val="0000FF"/>
+            <w:u w:val="single"/>
+          </w:rPr>
+          <w:t>Prompt Inventory</w:t>
+        </w:r>
+      </w:hyperlink>
+    </w:p>
+    <w:p>
+      <w:pPr>
+        <w:spacing w:after="40" w:before="40"/>
+        <w:ind w:left="360"/>
+      </w:pPr>
+      <w:hyperlink w:anchor="How_to_Use_These_Prompts">
+        <w:r>
+          <w:rPr>
+            <w:color w:val="0000FF"/>
+            <w:u w:val="single"/>
+          </w:rPr>
+          <w:t>How to Use These Prompts</w:t>
+        </w:r>
+      </w:hyperlink>
+    </w:p>
+    <w:p>
+      <w:pPr>
+        <w:spacing w:after="40" w:before="40"/>
+        <w:ind w:left="720"/>
+      </w:pPr>
+      <w:hyperlink w:anchor="With_Claude_Code">
+        <w:r>
+          <w:rPr>
+            <w:color w:val="0000FF"/>
+            <w:u w:val="single"/>
+          </w:rPr>
+          <w:t>With Claude Code</w:t>
+        </w:r>
+      </w:hyperlink>
+    </w:p>
+    <w:p>
+      <w:pPr>
+        <w:spacing w:after="40" w:before="40"/>
+        <w:ind w:left="720"/>
+      </w:pPr>
+      <w:hyperlink w:anchor="With_Human_Developers">
+        <w:r>
+          <w:rPr>
+            <w:color w:val="0000FF"/>
+            <w:u w:val="single"/>
+          </w:rPr>
+          <w:t>With Human Developers</w:t>
+        </w:r>
+      </w:hyperlink>
+    </w:p>
+    <w:p>
+      <w:pPr>
+        <w:spacing w:after="40" w:before="40"/>
+        <w:ind w:left="360"/>
+      </w:pPr>
+      <w:hyperlink w:anchor="Dependency_Graph">
+        <w:r>
+          <w:rPr>
+            <w:color w:val="0000FF"/>
+            <w:u w:val="single"/>
+          </w:rPr>
+          <w:t>Dependency Graph</w:t>
+        </w:r>
+      </w:hyperlink>
+    </w:p>
+    <w:p>
+      <w:pPr>
+        <w:spacing w:after="40" w:before="40"/>
+        <w:ind w:left="360"/>
+      </w:pPr>
+      <w:hyperlink w:anchor="Prompt_Template">
+        <w:r>
+          <w:rPr>
+            <w:color w:val="0000FF"/>
+            <w:u w:val="single"/>
+          </w:rPr>
+          <w:t>Prompt Template</w:t>
+        </w:r>
+      </w:hyperlink>
+    </w:p>
+    <w:p>
+      <w:r>
+        <w:br w:type="page"/>
+      </w:r>
+    </w:p>
     <w:p>
       <w:pPr>
         <w:pStyle w:val="Heading1"/>
@@ -1215,11 +1349,6 @@
     </w:p>
     <w:p>
       <w:pPr>
-        <w:numPr>
-          <w:ilvl w:val="0"/>
-          <w:numId w:val="1"/>
-          <w:numRestart w:val="1"/>
-        </w:numPr>
         <w:pStyle w:val="ListNumber"/>
         <w:spacing w:after="40" w:before="0"/>
       </w:pPr>

</xml_diff>